<commit_message>
Update Mid Devliv Contribution Form.docx
</commit_message>
<xml_diff>
--- a/WIP Report/Mid Devliv Contribution Form.docx
+++ b/WIP Report/Mid Devliv Contribution Form.docx
@@ -600,7 +600,6 @@
         <w:tblCellMar>
           <w:top w:w="44" w:type="dxa"/>
           <w:left w:w="89" w:type="dxa"/>
-          <w:bottom w:w="0" w:type="dxa"/>
           <w:right w:w="62" w:type="dxa"/>
         </w:tblCellMar>
         <w:tblLook w:val="04A0" w:firstRow="1" w:lastRow="0" w:firstColumn="1" w:lastColumn="0" w:noHBand="0" w:noVBand="1"/>
@@ -712,7 +711,16 @@
               <w:t xml:space="preserve"> </w:t>
             </w:r>
             <w:r>
-              <w:t xml:space="preserve">Assessment 2 – Interim SRS Report </w:t>
+              <w:t xml:space="preserve">Assessment </w:t>
+            </w:r>
+            <w:r>
+              <w:t>5</w:t>
+            </w:r>
+            <w:r>
+              <w:t xml:space="preserve"> – </w:t>
+            </w:r>
+            <w:r>
+              <w:t>Mid Project Deliverables</w:t>
             </w:r>
           </w:p>
         </w:tc>
@@ -765,7 +773,16 @@
               <w:t xml:space="preserve"> </w:t>
             </w:r>
             <w:r>
-              <w:t xml:space="preserve">6 April 2025 </w:t>
+              <w:t>18</w:t>
+            </w:r>
+            <w:r>
+              <w:t xml:space="preserve"> </w:t>
+            </w:r>
+            <w:r>
+              <w:t>May</w:t>
+            </w:r>
+            <w:r>
+              <w:t xml:space="preserve"> 2025 </w:t>
             </w:r>
           </w:p>
         </w:tc>
@@ -1094,7 +1111,6 @@
         <w:tblCellMar>
           <w:top w:w="44" w:type="dxa"/>
           <w:left w:w="89" w:type="dxa"/>
-          <w:bottom w:w="0" w:type="dxa"/>
           <w:right w:w="80" w:type="dxa"/>
         </w:tblCellMar>
         <w:tblLook w:val="04A0" w:firstRow="1" w:lastRow="0" w:firstColumn="1" w:lastColumn="0" w:noHBand="0" w:noVBand="1"/>
@@ -1239,7 +1255,13 @@
               <w:rPr>
                 <w:b/>
               </w:rPr>
-              <w:t xml:space="preserve">Define the scope </w:t>
+              <w:t>Created the Wireframe</w:t>
+            </w:r>
+            <w:r>
+              <w:rPr>
+                <w:b/>
+              </w:rPr>
+              <w:t xml:space="preserve"> </w:t>
             </w:r>
           </w:p>
         </w:tc>
@@ -1307,7 +1329,7 @@
               <w:rPr>
                 <w:b/>
               </w:rPr>
-              <w:t>Define the Key Deliverables</w:t>
+              <w:t>Worked on the feedback section</w:t>
             </w:r>
           </w:p>
         </w:tc>
@@ -1375,7 +1397,7 @@
               <w:rPr>
                 <w:b/>
               </w:rPr>
-              <w:t>Worked on the feedback section</w:t>
+              <w:t>Created the document structure</w:t>
             </w:r>
           </w:p>
         </w:tc>
@@ -1523,7 +1545,6 @@
         <w:tblCellMar>
           <w:top w:w="45" w:type="dxa"/>
           <w:left w:w="89" w:type="dxa"/>
-          <w:bottom w:w="0" w:type="dxa"/>
           <w:right w:w="80" w:type="dxa"/>
         </w:tblCellMar>
         <w:tblLook w:val="04A0" w:firstRow="1" w:lastRow="0" w:firstColumn="1" w:lastColumn="0" w:noHBand="0" w:noVBand="1"/>
@@ -1663,7 +1684,7 @@
               <w:rPr>
                 <w:b/>
               </w:rPr>
-              <w:t>Creating Project Charter</w:t>
+              <w:t>Programming and Implementation</w:t>
             </w:r>
           </w:p>
         </w:tc>
@@ -1731,7 +1752,7 @@
               <w:rPr>
                 <w:b/>
               </w:rPr>
-              <w:t xml:space="preserve">Determining the software to be used to build the project </w:t>
+              <w:t xml:space="preserve">Fixing the website </w:t>
             </w:r>
           </w:p>
         </w:tc>
@@ -1947,7 +1968,6 @@
         <w:tblCellMar>
           <w:top w:w="44" w:type="dxa"/>
           <w:left w:w="89" w:type="dxa"/>
-          <w:bottom w:w="0" w:type="dxa"/>
           <w:right w:w="80" w:type="dxa"/>
         </w:tblCellMar>
         <w:tblLook w:val="04A0" w:firstRow="1" w:lastRow="0" w:firstColumn="1" w:lastColumn="0" w:noHBand="0" w:noVBand="1"/>
@@ -2087,7 +2107,13 @@
               <w:rPr>
                 <w:b/>
               </w:rPr>
-              <w:t xml:space="preserve">Research on the feasibility study </w:t>
+              <w:t xml:space="preserve">System Architecture </w:t>
+            </w:r>
+            <w:r>
+              <w:rPr>
+                <w:b/>
+              </w:rPr>
+              <w:t xml:space="preserve"> </w:t>
             </w:r>
           </w:p>
         </w:tc>
@@ -2155,21 +2181,7 @@
               <w:rPr>
                 <w:b/>
               </w:rPr>
-              <w:t xml:space="preserve">Created </w:t>
-            </w:r>
-            <w:proofErr w:type="spellStart"/>
-            <w:r>
-              <w:rPr>
-                <w:b/>
-              </w:rPr>
-              <w:t>Github</w:t>
-            </w:r>
-            <w:proofErr w:type="spellEnd"/>
-            <w:r>
-              <w:rPr>
-                <w:b/>
-              </w:rPr>
-              <w:t xml:space="preserve"> page</w:t>
+              <w:t xml:space="preserve">Database Design </w:t>
             </w:r>
           </w:p>
         </w:tc>
@@ -2399,7 +2411,6 @@
         <w:tblCellMar>
           <w:top w:w="44" w:type="dxa"/>
           <w:left w:w="89" w:type="dxa"/>
-          <w:bottom w:w="0" w:type="dxa"/>
           <w:right w:w="80" w:type="dxa"/>
         </w:tblCellMar>
         <w:tblLook w:val="04A0" w:firstRow="1" w:lastRow="0" w:firstColumn="1" w:lastColumn="0" w:noHBand="0" w:noVBand="1"/>
@@ -2539,7 +2550,7 @@
               <w:rPr>
                 <w:b/>
               </w:rPr>
-              <w:t>Define Project Risk &amp; Mitigation</w:t>
+              <w:t xml:space="preserve">System Development Planning and Management </w:t>
             </w:r>
           </w:p>
         </w:tc>
@@ -2608,7 +2619,7 @@
               <w:rPr>
                 <w:b/>
               </w:rPr>
-              <w:t>Define Ethical Risk in Database</w:t>
+              <w:t xml:space="preserve">Teamwork Management </w:t>
             </w:r>
           </w:p>
         </w:tc>
@@ -2671,12 +2682,6 @@
                 <w:b/>
               </w:rPr>
               <w:t xml:space="preserve"> </w:t>
-            </w:r>
-            <w:r>
-              <w:rPr>
-                <w:b/>
-              </w:rPr>
-              <w:t xml:space="preserve">Created the document structure </w:t>
             </w:r>
           </w:p>
         </w:tc>
@@ -2821,7 +2826,6 @@
         <w:tblCellMar>
           <w:top w:w="44" w:type="dxa"/>
           <w:left w:w="89" w:type="dxa"/>
-          <w:bottom w:w="0" w:type="dxa"/>
           <w:right w:w="80" w:type="dxa"/>
         </w:tblCellMar>
         <w:tblLook w:val="04A0" w:firstRow="1" w:lastRow="0" w:firstColumn="1" w:lastColumn="0" w:noHBand="0" w:noVBand="1"/>
@@ -2862,13 +2866,7 @@
               <w:rPr>
                 <w:b/>
               </w:rPr>
-              <w:t>5</w:t>
-            </w:r>
-            <w:r>
-              <w:rPr>
-                <w:b/>
-              </w:rPr>
-              <w:t xml:space="preserve">  Student</w:t>
+              <w:t>5  Student</w:t>
             </w:r>
             <w:proofErr w:type="gramEnd"/>
             <w:r>
@@ -2966,13 +2964,13 @@
               <w:rPr>
                 <w:b/>
               </w:rPr>
-              <w:t xml:space="preserve"> </w:t>
-            </w:r>
-            <w:r>
-              <w:rPr>
-                <w:b/>
-              </w:rPr>
-              <w:t>Worked on the Project Description section</w:t>
+              <w:t xml:space="preserve"> Worked on the </w:t>
+            </w:r>
+            <w:r>
+              <w:rPr>
+                <w:b/>
+              </w:rPr>
+              <w:t>Introduction</w:t>
             </w:r>
           </w:p>
         </w:tc>
@@ -3034,13 +3032,7 @@
               <w:rPr>
                 <w:b/>
               </w:rPr>
-              <w:t xml:space="preserve"> </w:t>
-            </w:r>
-            <w:r>
-              <w:rPr>
-                <w:b/>
-              </w:rPr>
-              <w:t xml:space="preserve">Referencing Check </w:t>
+              <w:t xml:space="preserve"> Referencing Check </w:t>
             </w:r>
           </w:p>
         </w:tc>
@@ -3103,6 +3095,12 @@
                 <w:b/>
               </w:rPr>
               <w:t xml:space="preserve"> </w:t>
+            </w:r>
+            <w:r>
+              <w:rPr>
+                <w:b/>
+              </w:rPr>
+              <w:t>Business Requirement Elicitation</w:t>
             </w:r>
           </w:p>
         </w:tc>
@@ -3359,15 +3357,7 @@
           <w:sz w:val="27"/>
           <w:szCs w:val="27"/>
         </w:rPr>
-        <w:t>☑</w:t>
-      </w:r>
-      <w:r>
-        <w:rPr>
-          <w:rFonts w:ascii="Apple Color Emoji" w:hAnsi="Apple Color Emoji" w:cs="Apple Color Emoji"/>
-          <w:sz w:val="27"/>
-          <w:szCs w:val="27"/>
-        </w:rPr>
-        <w:t xml:space="preserve"> </w:t>
+        <w:t xml:space="preserve">☑ </w:t>
       </w:r>
       <w:r>
         <w:t xml:space="preserve">All work has been equally and </w:t>
@@ -3378,7 +3368,15 @@
       </w:r>
       <w:proofErr w:type="gramEnd"/>
       <w:r>
-        <w:t xml:space="preserve"> and all team members have contributed more or less equally. I think it is fair that we all receive the same team mark for all tasks completed by the team. (Write brief notes in the box below)- </w:t>
+        <w:t xml:space="preserve"> and all team members have contributed </w:t>
+      </w:r>
+      <w:proofErr w:type="gramStart"/>
+      <w:r>
+        <w:t>more or less equally</w:t>
+      </w:r>
+      <w:proofErr w:type="gramEnd"/>
+      <w:r>
+        <w:t xml:space="preserve">. I think it is fair that we all receive the same team mark for all tasks completed by the team. (Write brief notes in the box below)- </w:t>
       </w:r>
     </w:p>
     <w:tbl>
@@ -3389,7 +3387,6 @@
         <w:tblCellMar>
           <w:top w:w="46" w:type="dxa"/>
           <w:left w:w="108" w:type="dxa"/>
-          <w:bottom w:w="0" w:type="dxa"/>
           <w:right w:w="115" w:type="dxa"/>
         </w:tblCellMar>
         <w:tblLook w:val="04A0" w:firstRow="1" w:lastRow="0" w:firstColumn="1" w:lastColumn="0" w:noHBand="0" w:noVBand="1"/>
@@ -3585,7 +3582,6 @@
         <w:tblCellMar>
           <w:top w:w="46" w:type="dxa"/>
           <w:left w:w="108" w:type="dxa"/>
-          <w:bottom w:w="0" w:type="dxa"/>
           <w:right w:w="222" w:type="dxa"/>
         </w:tblCellMar>
         <w:tblLook w:val="04A0" w:firstRow="1" w:lastRow="0" w:firstColumn="1" w:lastColumn="0" w:noHBand="0" w:noVBand="1"/>
@@ -4259,7 +4255,19 @@
         <w:t>Date</w:t>
       </w:r>
       <w:r>
-        <w:t xml:space="preserve">: 1/4/2025 </w:t>
+        <w:t>: 1</w:t>
+      </w:r>
+      <w:r>
+        <w:t>8</w:t>
+      </w:r>
+      <w:r>
+        <w:t>/</w:t>
+      </w:r>
+      <w:r>
+        <w:t>5</w:t>
+      </w:r>
+      <w:r>
+        <w:t xml:space="preserve">/2025 </w:t>
       </w:r>
       <w:r>
         <w:t xml:space="preserve"> </w:t>

</xml_diff>